<commit_message>
Databases: passed lws on idef1x and normalization
</commit_message>
<xml_diff>
--- a/Data Analysis/LW4/report.docx
+++ b/Data Analysis/LW4/report.docx
@@ -1,16 +1,30 @@
 
 <file path=word/document.xml><?xml version="1.0" encoding="utf-8"?>
-<w:document xmlns:wpc="http://schemas.microsoft.com/office/word/2010/wordprocessingCanvas" xmlns:cx="http://schemas.microsoft.com/office/drawing/2014/chartex" xmlns:cx1="http://schemas.microsoft.com/office/drawing/2015/9/8/chartex" xmlns:cx2="http://schemas.microsoft.com/office/drawing/2015/10/21/chartex" xmlns:cx3="http://schemas.microsoft.com/office/drawing/2016/5/9/chartex" xmlns:cx4="http://schemas.microsoft.com/office/drawing/2016/5/10/chartex" xmlns:cx5="http://schemas.microsoft.com/office/drawing/2016/5/11/chartex" xmlns:cx6="http://schemas.microsoft.com/office/drawing/2016/5/12/chartex" xmlns:cx7="http://schemas.microsoft.com/office/drawing/2016/5/13/chartex" xmlns:cx8="http://schemas.microsoft.com/office/drawing/2016/5/14/chartex" xmlns:mc="http://schemas.openxmlformats.org/markup-compatibility/2006" xmlns:aink="http://schemas.microsoft.com/office/drawing/2016/ink" xmlns:am3d="http://schemas.microsoft.com/office/drawing/2017/model3d" xmlns:o="urn:schemas-microsoft-com:office:office" xmlns:r="http://schemas.openxmlformats.org/officeDocument/2006/relationships" xmlns:m="http://schemas.openxmlformats.org/officeDocument/2006/math" xmlns:v="urn:schemas-microsoft-com:vml" xmlns:wp14="http://schemas.microsoft.com/office/word/2010/wordprocessingDrawing" xmlns:wp="http://schemas.openxmlformats.org/drawingml/2006/wordprocessingDrawing" xmlns:w10="urn:schemas-microsoft-com:office:word" xmlns:w="http://schemas.openxmlformats.org/wordprocessingml/2006/main" xmlns:w14="http://schemas.microsoft.com/office/word/2010/wordml" xmlns:w15="http://schemas.microsoft.com/office/word/2012/wordml" xmlns:w16cex="http://schemas.microsoft.com/office/word/2018/wordml/cex" xmlns:w16cid="http://schemas.microsoft.com/office/word/2016/wordml/cid" xmlns:w16="http://schemas.microsoft.com/office/word/2018/wordml" xmlns:w16sdtdh="http://schemas.microsoft.com/office/word/2020/wordml/sdtdatahash" xmlns:w16se="http://schemas.microsoft.com/office/word/2015/wordml/symex" xmlns:wpg="http://schemas.microsoft.com/office/word/2010/wordprocessingGroup" xmlns:wpi="http://schemas.microsoft.com/office/word/2010/wordprocessingInk" xmlns:wne="http://schemas.microsoft.com/office/word/2006/wordml" xmlns:wps="http://schemas.microsoft.com/office/word/2010/wordprocessingShape" mc:Ignorable="w14 w15 w16se w16cid w16 w16cex w16sdtdh wp14">
+<w:document xmlns:wpc="http://schemas.microsoft.com/office/word/2010/wordprocessingCanvas" xmlns:cx="http://schemas.microsoft.com/office/drawing/2014/chartex" xmlns:cx1="http://schemas.microsoft.com/office/drawing/2015/9/8/chartex" xmlns:cx2="http://schemas.microsoft.com/office/drawing/2015/10/21/chartex" xmlns:cx3="http://schemas.microsoft.com/office/drawing/2016/5/9/chartex" xmlns:cx4="http://schemas.microsoft.com/office/drawing/2016/5/10/chartex" xmlns:cx5="http://schemas.microsoft.com/office/drawing/2016/5/11/chartex" xmlns:cx6="http://schemas.microsoft.com/office/drawing/2016/5/12/chartex" xmlns:cx7="http://schemas.microsoft.com/office/drawing/2016/5/13/chartex" xmlns:cx8="http://schemas.microsoft.com/office/drawing/2016/5/14/chartex" xmlns:mc="http://schemas.openxmlformats.org/markup-compatibility/2006" xmlns:aink="http://schemas.microsoft.com/office/drawing/2016/ink" xmlns:am3d="http://schemas.microsoft.com/office/drawing/2017/model3d" xmlns:o="urn:schemas-microsoft-com:office:office" xmlns:oel="http://schemas.microsoft.com/office/2019/extlst" xmlns:r="http://schemas.openxmlformats.org/officeDocument/2006/relationships" xmlns:m="http://schemas.openxmlformats.org/officeDocument/2006/math" xmlns:v="urn:schemas-microsoft-com:vml" xmlns:wp14="http://schemas.microsoft.com/office/word/2010/wordprocessingDrawing" xmlns:wp="http://schemas.openxmlformats.org/drawingml/2006/wordprocessingDrawing" xmlns:w10="urn:schemas-microsoft-com:office:word" xmlns:w="http://schemas.openxmlformats.org/wordprocessingml/2006/main" xmlns:w14="http://schemas.microsoft.com/office/word/2010/wordml" xmlns:w15="http://schemas.microsoft.com/office/word/2012/wordml" xmlns:w16cex="http://schemas.microsoft.com/office/word/2018/wordml/cex" xmlns:w16cid="http://schemas.microsoft.com/office/word/2016/wordml/cid" xmlns:w16="http://schemas.microsoft.com/office/word/2018/wordml" xmlns:w16du="http://schemas.microsoft.com/office/word/2023/wordml/word16du" xmlns:w16sdtdh="http://schemas.microsoft.com/office/word/2020/wordml/sdtdatahash" xmlns:w16sdtfl="http://schemas.microsoft.com/office/word/2024/wordml/sdtformatlock" xmlns:w16se="http://schemas.microsoft.com/office/word/2015/wordml/symex" xmlns:wpg="http://schemas.microsoft.com/office/word/2010/wordprocessingGroup" xmlns:wpi="http://schemas.microsoft.com/office/word/2010/wordprocessingInk" xmlns:wne="http://schemas.microsoft.com/office/word/2006/wordml" xmlns:wps="http://schemas.microsoft.com/office/word/2010/wordprocessingShape" mc:Ignorable="w14 w15 w16se w16cid w16 w16cex w16sdtdh w16sdtfl w16du wp14">
   <w:body>
     <w:p>
-      <w:r>
+      <w:pPr>
+        <w:rPr>
+          <w:lang w:val="en-US"/>
+        </w:rPr>
+      </w:pPr>
+      <w:r>
+        <w:rPr>
+          <w:lang w:val="en-US"/>
+        </w:rPr>
         <w:t>2,80514</w:t>
       </w:r>
       <w:r>
+        <w:rPr>
+          <w:lang w:val="en-US"/>
+        </w:rPr>
         <w:tab/>
         <w:t>6,53093</w:t>
       </w:r>
       <w:r>
+        <w:rPr>
+          <w:lang w:val="en-US"/>
+        </w:rPr>
         <w:tab/>
         <w:t>2,73691</w:t>
       </w:r>
@@ -22,505 +36,528 @@
         </w:rPr>
       </w:pPr>
       <w:r>
+        <w:rPr>
+          <w:lang w:val="en-US"/>
+        </w:rPr>
         <w:t>6,53093</w:t>
       </w:r>
       <w:r>
+        <w:rPr>
+          <w:lang w:val="en-US"/>
+        </w:rPr>
         <w:tab/>
         <w:t>35,51704</w:t>
       </w:r>
       <w:r>
+        <w:rPr>
+          <w:lang w:val="en-US"/>
+        </w:rPr>
+        <w:tab/>
+        <w:t xml:space="preserve">8,69404 - </w:t>
+      </w:r>
+      <w:r>
+        <w:rPr>
+          <w:lang w:val="en-US"/>
+        </w:rPr>
+        <w:t>teta</w:t>
+      </w:r>
+    </w:p>
+    <w:p>
+      <w:pPr>
+        <w:rPr>
+          <w:lang w:val="en-US"/>
+        </w:rPr>
+      </w:pPr>
+      <w:r>
+        <w:rPr>
+          <w:lang w:val="en-US"/>
+        </w:rPr>
+        <w:t>2,73691</w:t>
+      </w:r>
+      <w:r>
+        <w:rPr>
+          <w:lang w:val="en-US"/>
+        </w:rPr>
         <w:tab/>
         <w:t>8,69404</w:t>
       </w:r>
       <w:r>
-        <w:t xml:space="preserve"> - </w:t>
-      </w:r>
-      <w:r>
-        <w:rPr>
-          <w:lang w:val="en-US"/>
-        </w:rPr>
-        <w:t>teta</w:t>
-      </w:r>
-    </w:p>
-    <w:p>
-      <w:r>
+        <w:rPr>
+          <w:lang w:val="en-US"/>
+        </w:rPr>
+        <w:tab/>
+        <w:t>7,82729</w:t>
+      </w:r>
+    </w:p>
+    <w:p>
+      <w:pPr>
+        <w:rPr>
+          <w:lang w:val="en-US"/>
+        </w:rPr>
+      </w:pPr>
+    </w:p>
+    <w:p>
+      <w:pPr>
+        <w:rPr>
+          <w:lang w:val="en-US"/>
+        </w:rPr>
+      </w:pPr>
+      <w:r>
+        <w:rPr>
+          <w:lang w:val="en-US"/>
+        </w:rPr>
+        <w:t xml:space="preserve">Lambda1 = </w:t>
+      </w:r>
+      <w:r>
+        <w:rPr>
+          <w:lang w:val="en-US"/>
+        </w:rPr>
+        <w:t>38,224614</w:t>
+      </w:r>
+    </w:p>
+    <w:p>
+      <w:pPr>
+        <w:rPr>
+          <w:lang w:val="en-US"/>
+        </w:rPr>
+      </w:pPr>
+      <w:r>
+        <w:rPr>
+          <w:lang w:val="en-US"/>
+        </w:rPr>
+        <w:t xml:space="preserve">Lambda2 = </w:t>
+      </w:r>
+      <w:r>
+        <w:rPr>
+          <w:lang w:val="en-US"/>
+        </w:rPr>
+        <w:t>4,912701</w:t>
+      </w:r>
+    </w:p>
+    <w:p>
+      <w:pPr>
+        <w:rPr>
+          <w:lang w:val="en-US"/>
+        </w:rPr>
+      </w:pPr>
+      <w:r>
+        <w:rPr>
+          <w:lang w:val="en-US"/>
+        </w:rPr>
+        <w:t xml:space="preserve">Lambda3 = </w:t>
+      </w:r>
+      <w:r>
+        <w:rPr>
+          <w:lang w:val="en-US"/>
+        </w:rPr>
+        <w:t>0,862684</w:t>
+      </w:r>
+    </w:p>
+    <w:p>
+      <w:pPr>
+        <w:rPr>
+          <w:lang w:val="en-US"/>
+        </w:rPr>
+      </w:pPr>
+    </w:p>
+    <w:p>
+      <w:pPr>
+        <w:rPr>
+          <w:lang w:val="en-US"/>
+        </w:rPr>
+      </w:pPr>
+      <w:r>
+        <w:rPr>
+          <w:lang w:val="en-US"/>
+        </w:rPr>
+        <w:t>2,80514</w:t>
+      </w:r>
+      <w:r>
+        <w:rPr>
+          <w:lang w:val="en-US"/>
+        </w:rPr>
+        <w:tab/>
+        <w:t>6,53093</w:t>
+      </w:r>
+      <w:r>
+        <w:rPr>
+          <w:lang w:val="en-US"/>
+        </w:rPr>
+        <w:tab/>
         <w:t>2,73691</w:t>
       </w:r>
       <w:r>
+        <w:rPr>
+          <w:lang w:val="en-US"/>
+        </w:rPr>
+        <w:tab/>
+      </w:r>
+      <w:r>
+        <w:rPr>
+          <w:lang w:val="en-US"/>
+        </w:rPr>
+        <w:t>Fi1</w:t>
+      </w:r>
+      <w:r>
+        <w:rPr>
+          <w:lang w:val="en-US"/>
+        </w:rPr>
+        <w:tab/>
+      </w:r>
+      <w:r>
+        <w:rPr>
+          <w:lang w:val="en-US"/>
+        </w:rPr>
+        <w:tab/>
+      </w:r>
+      <w:r>
+        <w:rPr>
+          <w:lang w:val="en-US"/>
+        </w:rPr>
+        <w:tab/>
+        <w:t>Fi1</w:t>
+      </w:r>
+    </w:p>
+    <w:p>
+      <w:pPr>
+        <w:rPr>
+          <w:lang w:val="en-US"/>
+        </w:rPr>
+      </w:pPr>
+      <w:r>
+        <w:rPr>
+          <w:lang w:val="en-US"/>
+        </w:rPr>
+        <w:t>6,53093</w:t>
+      </w:r>
+      <w:r>
+        <w:rPr>
+          <w:lang w:val="en-US"/>
+        </w:rPr>
+        <w:tab/>
+        <w:t>35,51704</w:t>
+      </w:r>
+      <w:r>
+        <w:rPr>
+          <w:lang w:val="en-US"/>
+        </w:rPr>
+        <w:tab/>
+        <w:t xml:space="preserve">8,69404 </w:t>
+      </w:r>
+      <w:r>
+        <w:rPr>
+          <w:lang w:val="en-US"/>
+        </w:rPr>
+        <w:t xml:space="preserve"> * </w:t>
+      </w:r>
+      <w:r>
+        <w:rPr>
+          <w:lang w:val="en-US"/>
+        </w:rPr>
+        <w:tab/>
+        <w:t>Fi2 =</w:t>
+      </w:r>
+      <w:r>
+        <w:rPr>
+          <w:lang w:val="en-US"/>
+        </w:rPr>
+        <w:tab/>
+      </w:r>
+      <w:r>
+        <w:rPr>
+          <w:lang w:val="en-US"/>
+        </w:rPr>
+        <w:t>38,224614</w:t>
+      </w:r>
+      <w:r>
+        <w:rPr>
+          <w:lang w:val="en-US"/>
+        </w:rPr>
+        <w:t xml:space="preserve"> * </w:t>
+      </w:r>
+      <w:r>
+        <w:rPr>
+          <w:lang w:val="en-US"/>
+        </w:rPr>
+        <w:tab/>
+        <w:t>Fi2</w:t>
+      </w:r>
+    </w:p>
+    <w:p>
+      <w:pPr>
+        <w:rPr>
+          <w:lang w:val="en-US"/>
+        </w:rPr>
+      </w:pPr>
+      <w:r>
+        <w:rPr>
+          <w:lang w:val="en-US"/>
+        </w:rPr>
+        <w:t>2,73691</w:t>
+      </w:r>
+      <w:r>
+        <w:rPr>
+          <w:lang w:val="en-US"/>
+        </w:rPr>
         <w:tab/>
         <w:t>8,69404</w:t>
       </w:r>
       <w:r>
+        <w:rPr>
+          <w:lang w:val="en-US"/>
+        </w:rPr>
         <w:tab/>
         <w:t>7,82729</w:t>
       </w:r>
-    </w:p>
-    <w:p/>
-    <w:p>
-      <w:pPr>
-        <w:rPr>
-          <w:lang w:val="en-US"/>
-        </w:rPr>
-      </w:pPr>
-      <w:r>
-        <w:rPr>
-          <w:lang w:val="en-US"/>
-        </w:rPr>
-        <w:t xml:space="preserve">Lambda1 = </w:t>
-      </w:r>
-      <w:r>
-        <w:rPr>
-          <w:lang w:val="en-US"/>
-        </w:rPr>
-        <w:t>38,224614</w:t>
-      </w:r>
-    </w:p>
-    <w:p>
-      <w:pPr>
-        <w:rPr>
-          <w:lang w:val="en-US"/>
-        </w:rPr>
-      </w:pPr>
-      <w:r>
-        <w:rPr>
-          <w:lang w:val="en-US"/>
-        </w:rPr>
-        <w:t xml:space="preserve">Lambda2 = </w:t>
-      </w:r>
-      <w:r>
-        <w:rPr>
-          <w:lang w:val="en-US"/>
-        </w:rPr>
-        <w:t>4,912701</w:t>
-      </w:r>
-    </w:p>
-    <w:p>
-      <w:pPr>
-        <w:rPr>
-          <w:lang w:val="en-US"/>
-        </w:rPr>
-      </w:pPr>
-      <w:r>
-        <w:rPr>
-          <w:lang w:val="en-US"/>
-        </w:rPr>
-        <w:t xml:space="preserve">Lambda3 = </w:t>
-      </w:r>
-      <w:r>
-        <w:rPr>
-          <w:lang w:val="en-US"/>
-        </w:rPr>
-        <w:t>0,862684</w:t>
-      </w:r>
-    </w:p>
-    <w:p>
-      <w:pPr>
-        <w:rPr>
-          <w:lang w:val="en-US"/>
-        </w:rPr>
-      </w:pPr>
-    </w:p>
-    <w:p>
-      <w:pPr>
-        <w:rPr>
-          <w:lang w:val="en-US"/>
-        </w:rPr>
-      </w:pPr>
-      <w:r>
-        <w:t>2,80514</w:t>
-      </w:r>
-      <w:r>
+      <w:r>
+        <w:rPr>
+          <w:lang w:val="en-US"/>
+        </w:rPr>
+        <w:tab/>
+      </w:r>
+      <w:r>
+        <w:rPr>
+          <w:lang w:val="en-US"/>
+        </w:rPr>
+        <w:t>Fi3</w:t>
+      </w:r>
+      <w:r>
+        <w:rPr>
+          <w:lang w:val="en-US"/>
+        </w:rPr>
+        <w:tab/>
+      </w:r>
+      <w:r>
+        <w:rPr>
+          <w:lang w:val="en-US"/>
+        </w:rPr>
+        <w:tab/>
+      </w:r>
+      <w:r>
+        <w:rPr>
+          <w:lang w:val="en-US"/>
+        </w:rPr>
+        <w:tab/>
+        <w:t>Fi3</w:t>
+      </w:r>
+    </w:p>
+    <w:p>
+      <w:pPr>
+        <w:rPr>
+          <w:lang w:val="en-US"/>
+        </w:rPr>
+      </w:pPr>
+    </w:p>
+    <w:p>
+      <w:pPr>
+        <w:rPr>
+          <w:lang w:val="en-US"/>
+        </w:rPr>
+      </w:pPr>
+      <w:r>
+        <w:rPr>
+          <w:lang w:val="en-US"/>
+        </w:rPr>
+        <w:t>-35,41947</w:t>
+      </w:r>
+      <w:r>
+        <w:rPr>
+          <w:lang w:val="en-US"/>
+        </w:rPr>
+        <w:t xml:space="preserve">*Fi11 </w:t>
+      </w:r>
+      <w:r>
+        <w:rPr>
+          <w:lang w:val="en-US"/>
+        </w:rPr>
         <w:tab/>
         <w:t>6,53093</w:t>
       </w:r>
-      <w:r>
+      <w:bookmarkStart w:id="0" w:name="_Hlk214818717"/>
+      <w:r>
+        <w:rPr>
+          <w:lang w:val="en-US"/>
+        </w:rPr>
+        <w:t>*Fi21</w:t>
+      </w:r>
+      <w:bookmarkEnd w:id="0"/>
+      <w:r>
+        <w:rPr>
+          <w:lang w:val="en-US"/>
+        </w:rPr>
+        <w:tab/>
+      </w:r>
+      <w:r>
+        <w:rPr>
+          <w:lang w:val="en-US"/>
+        </w:rPr>
         <w:tab/>
         <w:t>2,73691</w:t>
       </w:r>
       <w:r>
-        <w:tab/>
-      </w:r>
-      <w:r>
-        <w:rPr>
-          <w:lang w:val="en-US"/>
-        </w:rPr>
-        <w:t>Fi1</w:t>
-      </w:r>
-      <w:r>
-        <w:rPr>
-          <w:lang w:val="en-US"/>
-        </w:rPr>
-        <w:tab/>
-      </w:r>
-      <w:r>
-        <w:rPr>
-          <w:lang w:val="en-US"/>
-        </w:rPr>
-        <w:tab/>
-      </w:r>
-      <w:r>
-        <w:rPr>
-          <w:lang w:val="en-US"/>
-        </w:rPr>
-        <w:tab/>
-        <w:t>Fi1</w:t>
-      </w:r>
-    </w:p>
-    <w:p>
-      <w:pPr>
-        <w:rPr>
-          <w:lang w:val="en-US"/>
-        </w:rPr>
-      </w:pPr>
-      <w:r>
+        <w:rPr>
+          <w:lang w:val="en-US"/>
+        </w:rPr>
+        <w:t>*Fi13</w:t>
+      </w:r>
+      <w:r>
+        <w:rPr>
+          <w:lang w:val="en-US"/>
+        </w:rPr>
+        <w:tab/>
+      </w:r>
+      <w:r>
+        <w:rPr>
+          <w:lang w:val="en-US"/>
+        </w:rPr>
+        <w:tab/>
+      </w:r>
+      <w:r>
+        <w:rPr>
+          <w:lang w:val="en-US"/>
+        </w:rPr>
+        <w:tab/>
+        <w:t>0</w:t>
+      </w:r>
+    </w:p>
+    <w:p>
+      <w:pPr>
+        <w:rPr>
+          <w:lang w:val="en-US"/>
+        </w:rPr>
+      </w:pPr>
+      <w:r>
+        <w:rPr>
+          <w:lang w:val="en-US"/>
+        </w:rPr>
         <w:t>6,53093</w:t>
       </w:r>
       <w:r>
-        <w:tab/>
-        <w:t>35,51704</w:t>
-      </w:r>
-      <w:r>
-        <w:tab/>
-        <w:t xml:space="preserve">8,69404 </w:t>
-      </w:r>
-      <w:r>
-        <w:rPr>
-          <w:lang w:val="en-US"/>
-        </w:rPr>
-        <w:t xml:space="preserve"> * </w:t>
-      </w:r>
-      <w:r>
-        <w:rPr>
-          <w:lang w:val="en-US"/>
-        </w:rPr>
-        <w:tab/>
-        <w:t>Fi2 =</w:t>
-      </w:r>
-      <w:r>
-        <w:rPr>
-          <w:lang w:val="en-US"/>
-        </w:rPr>
-        <w:tab/>
-      </w:r>
-      <w:r>
-        <w:rPr>
-          <w:lang w:val="en-US"/>
-        </w:rPr>
-        <w:t>38,224614</w:t>
-      </w:r>
-      <w:r>
-        <w:rPr>
-          <w:lang w:val="en-US"/>
-        </w:rPr>
-        <w:t xml:space="preserve"> * </w:t>
-      </w:r>
-      <w:r>
-        <w:rPr>
-          <w:lang w:val="en-US"/>
-        </w:rPr>
-        <w:tab/>
-        <w:t>Fi2</w:t>
-      </w:r>
-    </w:p>
-    <w:p>
-      <w:pPr>
-        <w:rPr>
-          <w:lang w:val="en-US"/>
-        </w:rPr>
-      </w:pPr>
-      <w:r>
+        <w:rPr>
+          <w:lang w:val="en-US"/>
+        </w:rPr>
+        <w:t>*Fi11</w:t>
+      </w:r>
+      <w:r>
+        <w:rPr>
+          <w:lang w:val="en-US"/>
+        </w:rPr>
+        <w:tab/>
+      </w:r>
+      <w:r>
+        <w:rPr>
+          <w:lang w:val="en-US"/>
+        </w:rPr>
+        <w:tab/>
+        <w:t>-2,70757</w:t>
+      </w:r>
+      <w:r>
+        <w:rPr>
+          <w:lang w:val="en-US"/>
+        </w:rPr>
+        <w:t>*Fi21</w:t>
+      </w:r>
+      <w:r>
+        <w:rPr>
+          <w:lang w:val="en-US"/>
+        </w:rPr>
+        <w:tab/>
+      </w:r>
+      <w:r>
+        <w:rPr>
+          <w:lang w:val="en-US"/>
+        </w:rPr>
+        <w:tab/>
+        <w:t>8,69404</w:t>
+      </w:r>
+      <w:r>
+        <w:rPr>
+          <w:lang w:val="en-US"/>
+        </w:rPr>
+        <w:t>*Fi13</w:t>
+      </w:r>
+      <w:r>
+        <w:rPr>
+          <w:lang w:val="en-US"/>
+        </w:rPr>
+        <w:t xml:space="preserve"> </w:t>
+      </w:r>
+      <w:r>
+        <w:rPr>
+          <w:lang w:val="en-US"/>
+        </w:rPr>
+        <w:tab/>
+      </w:r>
+      <w:r>
+        <w:rPr>
+          <w:lang w:val="en-US"/>
+        </w:rPr>
+        <w:tab/>
+        <w:t>=</w:t>
+      </w:r>
+      <w:r>
+        <w:rPr>
+          <w:lang w:val="en-US"/>
+        </w:rPr>
+        <w:tab/>
+        <w:t>0</w:t>
+      </w:r>
+    </w:p>
+    <w:p>
+      <w:pPr>
+        <w:rPr>
+          <w:lang w:val="en-US"/>
+        </w:rPr>
+      </w:pPr>
+      <w:r>
+        <w:rPr>
+          <w:lang w:val="en-US"/>
+        </w:rPr>
         <w:t>2,73691</w:t>
       </w:r>
       <w:r>
+        <w:rPr>
+          <w:lang w:val="en-US"/>
+        </w:rPr>
+        <w:t>*Fi11</w:t>
+      </w:r>
+      <w:r>
+        <w:rPr>
+          <w:lang w:val="en-US"/>
+        </w:rPr>
+        <w:tab/>
+      </w:r>
+      <w:r>
+        <w:rPr>
+          <w:lang w:val="en-US"/>
+        </w:rPr>
         <w:tab/>
         <w:t>8,69404</w:t>
       </w:r>
       <w:r>
-        <w:tab/>
-        <w:t>7,82729</w:t>
-      </w:r>
-      <w:r>
-        <w:tab/>
-      </w:r>
-      <w:r>
-        <w:rPr>
-          <w:lang w:val="en-US"/>
-        </w:rPr>
-        <w:t>Fi3</w:t>
-      </w:r>
-      <w:r>
-        <w:rPr>
-          <w:lang w:val="en-US"/>
-        </w:rPr>
-        <w:tab/>
-      </w:r>
-      <w:r>
-        <w:rPr>
-          <w:lang w:val="en-US"/>
-        </w:rPr>
-        <w:tab/>
-      </w:r>
-      <w:r>
-        <w:rPr>
-          <w:lang w:val="en-US"/>
-        </w:rPr>
-        <w:tab/>
-        <w:t>Fi3</w:t>
-      </w:r>
-    </w:p>
-    <w:p>
-      <w:pPr>
-        <w:rPr>
-          <w:lang w:val="en-US"/>
-        </w:rPr>
-      </w:pPr>
-    </w:p>
-    <w:p>
-      <w:pPr>
-        <w:rPr>
-          <w:lang w:val="en-US"/>
-        </w:rPr>
-      </w:pPr>
-      <w:r>
-        <w:rPr>
-          <w:lang w:val="en-US"/>
-        </w:rPr>
-        <w:t>-35,41947</w:t>
-      </w:r>
-      <w:r>
-        <w:rPr>
-          <w:lang w:val="en-US"/>
-        </w:rPr>
-        <w:t xml:space="preserve">*Fi11 </w:t>
-      </w:r>
-      <w:r>
-        <w:rPr>
-          <w:lang w:val="en-US"/>
-        </w:rPr>
-        <w:tab/>
-        <w:t>6,53093</w:t>
-      </w:r>
-      <w:bookmarkStart w:id="0" w:name="_Hlk214818717"/>
-      <w:r>
-        <w:rPr>
-          <w:lang w:val="en-US"/>
-        </w:rPr>
-        <w:t>*Fi</w:t>
-      </w:r>
-      <w:r>
-        <w:rPr>
-          <w:lang w:val="en-US"/>
-        </w:rPr>
-        <w:t>2</w:t>
-      </w:r>
-      <w:r>
-        <w:rPr>
-          <w:lang w:val="en-US"/>
-        </w:rPr>
-        <w:t>1</w:t>
-      </w:r>
-      <w:bookmarkEnd w:id="0"/>
-      <w:r>
-        <w:rPr>
-          <w:lang w:val="en-US"/>
-        </w:rPr>
-        <w:tab/>
-      </w:r>
-      <w:r>
-        <w:rPr>
-          <w:lang w:val="en-US"/>
-        </w:rPr>
-        <w:tab/>
-        <w:t>2,73691</w:t>
+        <w:rPr>
+          <w:lang w:val="en-US"/>
+        </w:rPr>
+        <w:t>*Fi21</w:t>
+      </w:r>
+      <w:r>
+        <w:rPr>
+          <w:lang w:val="en-US"/>
+        </w:rPr>
+        <w:tab/>
+      </w:r>
+      <w:r>
+        <w:rPr>
+          <w:lang w:val="en-US"/>
+        </w:rPr>
+        <w:tab/>
+        <w:t>-30,39732</w:t>
       </w:r>
       <w:r>
         <w:rPr>
           <w:lang w:val="en-US"/>
         </w:rPr>
         <w:t>*Fi13</w:t>
-      </w:r>
-      <w:r>
-        <w:rPr>
-          <w:lang w:val="en-US"/>
-        </w:rPr>
-        <w:tab/>
-      </w:r>
-      <w:r>
-        <w:rPr>
-          <w:lang w:val="en-US"/>
-        </w:rPr>
-        <w:tab/>
-      </w:r>
-      <w:r>
-        <w:rPr>
-          <w:lang w:val="en-US"/>
-        </w:rPr>
-        <w:tab/>
-        <w:t>0</w:t>
-      </w:r>
-    </w:p>
-    <w:p>
-      <w:pPr>
-        <w:rPr>
-          <w:lang w:val="en-US"/>
-        </w:rPr>
-      </w:pPr>
-      <w:r>
-        <w:rPr>
-          <w:lang w:val="en-US"/>
-        </w:rPr>
-        <w:t>6,53093</w:t>
-      </w:r>
-      <w:r>
-        <w:rPr>
-          <w:lang w:val="en-US"/>
-        </w:rPr>
-        <w:t>*Fi11</w:t>
-      </w:r>
-      <w:r>
-        <w:rPr>
-          <w:lang w:val="en-US"/>
-        </w:rPr>
-        <w:tab/>
-      </w:r>
-      <w:r>
-        <w:rPr>
-          <w:lang w:val="en-US"/>
-        </w:rPr>
-        <w:tab/>
-        <w:t>-2,70757</w:t>
-      </w:r>
-      <w:r>
-        <w:rPr>
-          <w:lang w:val="en-US"/>
-        </w:rPr>
-        <w:t>*Fi21</w:t>
-      </w:r>
-      <w:r>
-        <w:rPr>
-          <w:lang w:val="en-US"/>
-        </w:rPr>
-        <w:tab/>
-      </w:r>
-      <w:r>
-        <w:rPr>
-          <w:lang w:val="en-US"/>
-        </w:rPr>
-        <w:tab/>
-        <w:t>8,69404</w:t>
-      </w:r>
-      <w:r>
-        <w:rPr>
-          <w:lang w:val="en-US"/>
-        </w:rPr>
-        <w:t>*Fi</w:t>
-      </w:r>
-      <w:r>
-        <w:rPr>
-          <w:lang w:val="en-US"/>
-        </w:rPr>
-        <w:t>1</w:t>
-      </w:r>
-      <w:r>
-        <w:rPr>
-          <w:lang w:val="en-US"/>
-        </w:rPr>
-        <w:t>3</w:t>
-      </w:r>
-      <w:r>
-        <w:rPr>
-          <w:lang w:val="en-US"/>
-        </w:rPr>
-        <w:t xml:space="preserve"> </w:t>
-      </w:r>
-      <w:r>
-        <w:rPr>
-          <w:lang w:val="en-US"/>
-        </w:rPr>
-        <w:tab/>
-      </w:r>
-      <w:r>
-        <w:rPr>
-          <w:lang w:val="en-US"/>
-        </w:rPr>
-        <w:tab/>
-        <w:t>=</w:t>
-      </w:r>
-      <w:r>
-        <w:rPr>
-          <w:lang w:val="en-US"/>
-        </w:rPr>
-        <w:tab/>
-        <w:t>0</w:t>
-      </w:r>
-    </w:p>
-    <w:p>
-      <w:pPr>
-        <w:rPr>
-          <w:lang w:val="en-US"/>
-        </w:rPr>
-      </w:pPr>
-      <w:r>
-        <w:rPr>
-          <w:lang w:val="en-US"/>
-        </w:rPr>
-        <w:t>2,73691</w:t>
-      </w:r>
-      <w:r>
-        <w:rPr>
-          <w:lang w:val="en-US"/>
-        </w:rPr>
-        <w:t>*Fi11</w:t>
-      </w:r>
-      <w:r>
-        <w:rPr>
-          <w:lang w:val="en-US"/>
-        </w:rPr>
-        <w:tab/>
-      </w:r>
-      <w:r>
-        <w:rPr>
-          <w:lang w:val="en-US"/>
-        </w:rPr>
-        <w:tab/>
-        <w:t>8,69404</w:t>
-      </w:r>
-      <w:r>
-        <w:rPr>
-          <w:lang w:val="en-US"/>
-        </w:rPr>
-        <w:t>*Fi21</w:t>
-      </w:r>
-      <w:r>
-        <w:rPr>
-          <w:lang w:val="en-US"/>
-        </w:rPr>
-        <w:tab/>
-      </w:r>
-      <w:r>
-        <w:rPr>
-          <w:lang w:val="en-US"/>
-        </w:rPr>
-        <w:tab/>
-        <w:t>-30,39732</w:t>
-      </w:r>
-      <w:r>
-        <w:rPr>
-          <w:lang w:val="en-US"/>
-        </w:rPr>
-        <w:t>*Fi</w:t>
-      </w:r>
-      <w:r>
-        <w:rPr>
-          <w:lang w:val="en-US"/>
-        </w:rPr>
-        <w:t>1</w:t>
-      </w:r>
-      <w:r>
-        <w:rPr>
-          <w:lang w:val="en-US"/>
-        </w:rPr>
-        <w:t>3</w:t>
       </w:r>
       <w:r>
         <w:rPr>
@@ -654,7 +691,7 @@
 </file>
 
 <file path=word/styles.xml><?xml version="1.0" encoding="utf-8"?>
-<w:styles xmlns:mc="http://schemas.openxmlformats.org/markup-compatibility/2006" xmlns:r="http://schemas.openxmlformats.org/officeDocument/2006/relationships" xmlns:w="http://schemas.openxmlformats.org/wordprocessingml/2006/main" xmlns:w14="http://schemas.microsoft.com/office/word/2010/wordml" xmlns:w15="http://schemas.microsoft.com/office/word/2012/wordml" xmlns:w16cex="http://schemas.microsoft.com/office/word/2018/wordml/cex" xmlns:w16cid="http://schemas.microsoft.com/office/word/2016/wordml/cid" xmlns:w16="http://schemas.microsoft.com/office/word/2018/wordml" xmlns:w16sdtdh="http://schemas.microsoft.com/office/word/2020/wordml/sdtdatahash" xmlns:w16se="http://schemas.microsoft.com/office/word/2015/wordml/symex" mc:Ignorable="w14 w15 w16se w16cid w16 w16cex w16sdtdh">
+<w:styles xmlns:mc="http://schemas.openxmlformats.org/markup-compatibility/2006" xmlns:r="http://schemas.openxmlformats.org/officeDocument/2006/relationships" xmlns:w="http://schemas.openxmlformats.org/wordprocessingml/2006/main" xmlns:w14="http://schemas.microsoft.com/office/word/2010/wordml" xmlns:w15="http://schemas.microsoft.com/office/word/2012/wordml" xmlns:w16cex="http://schemas.microsoft.com/office/word/2018/wordml/cex" xmlns:w16cid="http://schemas.microsoft.com/office/word/2016/wordml/cid" xmlns:w16="http://schemas.microsoft.com/office/word/2018/wordml" xmlns:w16du="http://schemas.microsoft.com/office/word/2023/wordml/word16du" xmlns:w16sdtdh="http://schemas.microsoft.com/office/word/2020/wordml/sdtdatahash" xmlns:w16sdtfl="http://schemas.microsoft.com/office/word/2024/wordml/sdtformatlock" xmlns:w16se="http://schemas.microsoft.com/office/word/2015/wordml/symex" mc:Ignorable="w14 w15 w16se w16cid w16 w16cex w16sdtdh w16sdtfl w16du">
   <w:docDefaults>
     <w:rPrDefault>
       <w:rPr>

</xml_diff>